<commit_message>
Documento 1 Fase 2
Se completa el documento del Product Vision, sujeto a revisiones posteriores.
</commit_message>
<xml_diff>
--- a/Fase 2/Evidencias Proyecto (version Agil)/Documento 01- Product Vision.docx
+++ b/Fase 2/Evidencias Proyecto (version Agil)/Documento 01- Product Vision.docx
@@ -554,7 +554,7 @@
               <w:kern w:val="2"/>
               <w:sz w:val="24"/>
               <w:szCs w:val="24"/>
-              <w:lang w:val="es-CL" w:eastAsia="es-MX"/>
+              <w:lang w:val="es-CL" w:eastAsia="es-CL"/>
               <w14:ligatures w14:val="standardContextual"/>
             </w:rPr>
           </w:pPr>
@@ -583,7 +583,7 @@
             </w:rPr>
             <w:fldChar w:fldCharType="separate"/>
           </w:r>
-          <w:hyperlink w:anchor="_Toc241503854" w:history="1">
+          <w:hyperlink w:anchor="_Toc241610598" w:history="1">
             <w:r>
               <w:rPr>
                 <w:rStyle w:val="Hipervnculo"/>
@@ -603,7 +603,7 @@
                 <w:kern w:val="2"/>
                 <w:sz w:val="24"/>
                 <w:szCs w:val="24"/>
-                <w:lang w:val="es-CL" w:eastAsia="es-MX"/>
+                <w:lang w:val="es-CL" w:eastAsia="es-CL"/>
                 <w14:ligatures w14:val="standardContextual"/>
               </w:rPr>
               <w:tab/>
@@ -636,7 +636,7 @@
                 <w:noProof/>
                 <w:webHidden/>
               </w:rPr>
-              <w:instrText xml:space="preserve"> PAGEREF _Toc241503854 \h </w:instrText>
+              <w:instrText xml:space="preserve"> PAGEREF _Toc241610598 \h </w:instrText>
             </w:r>
             <w:r>
               <w:rPr>
@@ -683,11 +683,11 @@
               <w:kern w:val="2"/>
               <w:sz w:val="24"/>
               <w:szCs w:val="24"/>
-              <w:lang w:val="es-CL" w:eastAsia="es-MX"/>
+              <w:lang w:val="es-CL" w:eastAsia="es-CL"/>
               <w14:ligatures w14:val="standardContextual"/>
             </w:rPr>
           </w:pPr>
-          <w:hyperlink w:anchor="_Toc241503855" w:history="1">
+          <w:hyperlink w:anchor="_Toc241610599" w:history="1">
             <w:r>
               <w:rPr>
                 <w:rStyle w:val="Hipervnculo"/>
@@ -705,7 +705,7 @@
                 <w:kern w:val="2"/>
                 <w:sz w:val="24"/>
                 <w:szCs w:val="24"/>
-                <w:lang w:val="es-CL" w:eastAsia="es-MX"/>
+                <w:lang w:val="es-CL" w:eastAsia="es-CL"/>
                 <w14:ligatures w14:val="standardContextual"/>
               </w:rPr>
               <w:tab/>
@@ -736,7 +736,7 @@
                 <w:noProof/>
                 <w:webHidden/>
               </w:rPr>
-              <w:instrText xml:space="preserve"> PAGEREF _Toc241503855 \h </w:instrText>
+              <w:instrText xml:space="preserve"> PAGEREF _Toc241610599 \h </w:instrText>
             </w:r>
             <w:r>
               <w:rPr>
@@ -783,11 +783,11 @@
               <w:kern w:val="2"/>
               <w:sz w:val="24"/>
               <w:szCs w:val="24"/>
-              <w:lang w:val="es-CL" w:eastAsia="es-MX"/>
+              <w:lang w:val="es-CL" w:eastAsia="es-CL"/>
               <w14:ligatures w14:val="standardContextual"/>
             </w:rPr>
           </w:pPr>
-          <w:hyperlink w:anchor="_Toc241503856" w:history="1">
+          <w:hyperlink w:anchor="_Toc241610600" w:history="1">
             <w:r>
               <w:rPr>
                 <w:rStyle w:val="Hipervnculo"/>
@@ -806,7 +806,7 @@
                 <w:kern w:val="2"/>
                 <w:sz w:val="24"/>
                 <w:szCs w:val="24"/>
-                <w:lang w:val="es-CL" w:eastAsia="es-MX"/>
+                <w:lang w:val="es-CL" w:eastAsia="es-CL"/>
                 <w14:ligatures w14:val="standardContextual"/>
               </w:rPr>
               <w:tab/>
@@ -838,7 +838,7 @@
                 <w:noProof/>
                 <w:webHidden/>
               </w:rPr>
-              <w:instrText xml:space="preserve"> PAGEREF _Toc241503856 \h </w:instrText>
+              <w:instrText xml:space="preserve"> PAGEREF _Toc241610600 \h </w:instrText>
             </w:r>
             <w:r>
               <w:rPr>
@@ -883,11 +883,11 @@
               <w:kern w:val="2"/>
               <w:sz w:val="24"/>
               <w:szCs w:val="24"/>
-              <w:lang w:val="es-CL" w:eastAsia="es-MX"/>
+              <w:lang w:val="es-CL" w:eastAsia="es-CL"/>
               <w14:ligatures w14:val="standardContextual"/>
             </w:rPr>
           </w:pPr>
-          <w:hyperlink w:anchor="_Toc241503857" w:history="1">
+          <w:hyperlink w:anchor="_Toc241610601" w:history="1">
             <w:r>
               <w:rPr>
                 <w:rStyle w:val="Hipervnculo"/>
@@ -904,7 +904,7 @@
                 <w:kern w:val="2"/>
                 <w:sz w:val="24"/>
                 <w:szCs w:val="24"/>
-                <w:lang w:val="es-CL" w:eastAsia="es-MX"/>
+                <w:lang w:val="es-CL" w:eastAsia="es-CL"/>
                 <w14:ligatures w14:val="standardContextual"/>
               </w:rPr>
               <w:tab/>
@@ -936,7 +936,7 @@
                 <w:noProof/>
                 <w:webHidden/>
               </w:rPr>
-              <w:instrText xml:space="preserve"> PAGEREF _Toc241503857 \h </w:instrText>
+              <w:instrText xml:space="preserve"> PAGEREF _Toc241610601 \h </w:instrText>
             </w:r>
             <w:r>
               <w:rPr>
@@ -981,11 +981,11 @@
               <w:kern w:val="2"/>
               <w:sz w:val="24"/>
               <w:szCs w:val="24"/>
-              <w:lang w:val="es-CL" w:eastAsia="es-MX"/>
+              <w:lang w:val="es-CL" w:eastAsia="es-CL"/>
               <w14:ligatures w14:val="standardContextual"/>
             </w:rPr>
           </w:pPr>
-          <w:hyperlink w:anchor="_Toc241503858" w:history="1">
+          <w:hyperlink w:anchor="_Toc241610602" w:history="1">
             <w:r>
               <w:rPr>
                 <w:rStyle w:val="Hipervnculo"/>
@@ -1001,7 +1001,7 @@
                 <w:kern w:val="2"/>
                 <w:sz w:val="24"/>
                 <w:szCs w:val="24"/>
-                <w:lang w:val="es-CL" w:eastAsia="es-MX"/>
+                <w:lang w:val="es-CL" w:eastAsia="es-CL"/>
                 <w14:ligatures w14:val="standardContextual"/>
               </w:rPr>
               <w:tab/>
@@ -1032,7 +1032,7 @@
                 <w:noProof/>
                 <w:webHidden/>
               </w:rPr>
-              <w:instrText xml:space="preserve"> PAGEREF _Toc241503858 \h </w:instrText>
+              <w:instrText xml:space="preserve"> PAGEREF _Toc241610602 \h </w:instrText>
             </w:r>
             <w:r>
               <w:rPr>
@@ -1052,7 +1052,7 @@
                 <w:noProof/>
                 <w:webHidden/>
               </w:rPr>
-              <w:t>4</w:t>
+              <w:t>5</w:t>
             </w:r>
             <w:r>
               <w:rPr>
@@ -1078,17 +1078,17 @@
               <w:kern w:val="2"/>
               <w:sz w:val="24"/>
               <w:szCs w:val="24"/>
-              <w:lang w:val="es-CL" w:eastAsia="es-MX"/>
+              <w:lang w:val="es-CL" w:eastAsia="es-CL"/>
               <w14:ligatures w14:val="standardContextual"/>
             </w:rPr>
           </w:pPr>
-          <w:hyperlink w:anchor="_Toc241503859" w:history="1">
+          <w:hyperlink w:anchor="_Toc241610603" w:history="1">
             <w:r>
               <w:rPr>
                 <w:rStyle w:val="Hipervnculo"/>
                 <w:noProof/>
               </w:rPr>
-              <w:t>4.2.1</w:t>
+              <w:t>4.2.2</w:t>
             </w:r>
             <w:r>
               <w:rPr>
@@ -1099,7 +1099,7 @@
                 <w:kern w:val="2"/>
                 <w:sz w:val="24"/>
                 <w:szCs w:val="24"/>
-                <w:lang w:val="es-CL" w:eastAsia="es-MX"/>
+                <w:lang w:val="es-CL" w:eastAsia="es-CL"/>
                 <w14:ligatures w14:val="standardContextual"/>
               </w:rPr>
               <w:tab/>
@@ -1109,7 +1109,7 @@
                 <w:rStyle w:val="Hipervnculo"/>
                 <w:noProof/>
               </w:rPr>
-              <w:t>Usuario 1</w:t>
+              <w:t>Usuario 2: Operador de proceso</w:t>
             </w:r>
             <w:r>
               <w:rPr>
@@ -1130,7 +1130,7 @@
                 <w:noProof/>
                 <w:webHidden/>
               </w:rPr>
-              <w:instrText xml:space="preserve"> PAGEREF _Toc241503859 \h </w:instrText>
+              <w:instrText xml:space="preserve"> PAGEREF _Toc241610603 \h </w:instrText>
             </w:r>
             <w:r>
               <w:rPr>
@@ -1150,7 +1150,7 @@
                 <w:noProof/>
                 <w:webHidden/>
               </w:rPr>
-              <w:t>4</w:t>
+              <w:t>5</w:t>
             </w:r>
             <w:r>
               <w:rPr>
@@ -1176,17 +1176,17 @@
               <w:kern w:val="2"/>
               <w:sz w:val="24"/>
               <w:szCs w:val="24"/>
-              <w:lang w:val="es-CL" w:eastAsia="es-MX"/>
+              <w:lang w:val="es-CL" w:eastAsia="es-CL"/>
               <w14:ligatures w14:val="standardContextual"/>
             </w:rPr>
           </w:pPr>
-          <w:hyperlink w:anchor="_Toc241503860" w:history="1">
+          <w:hyperlink w:anchor="_Toc241610604" w:history="1">
             <w:r>
               <w:rPr>
                 <w:rStyle w:val="Hipervnculo"/>
                 <w:noProof/>
               </w:rPr>
-              <w:t>4.2.2</w:t>
+              <w:t>4.2.3</w:t>
             </w:r>
             <w:r>
               <w:rPr>
@@ -1197,7 +1197,7 @@
                 <w:kern w:val="2"/>
                 <w:sz w:val="24"/>
                 <w:szCs w:val="24"/>
-                <w:lang w:val="es-CL" w:eastAsia="es-MX"/>
+                <w:lang w:val="es-CL" w:eastAsia="es-CL"/>
                 <w14:ligatures w14:val="standardContextual"/>
               </w:rPr>
               <w:tab/>
@@ -1207,7 +1207,7 @@
                 <w:rStyle w:val="Hipervnculo"/>
                 <w:noProof/>
               </w:rPr>
-              <w:t>Usuario 1</w:t>
+              <w:t>Usuario 3: Operador de bodega</w:t>
             </w:r>
             <w:r>
               <w:rPr>
@@ -1228,7 +1228,7 @@
                 <w:noProof/>
                 <w:webHidden/>
               </w:rPr>
-              <w:instrText xml:space="preserve"> PAGEREF _Toc241503860 \h </w:instrText>
+              <w:instrText xml:space="preserve"> PAGEREF _Toc241610604 \h </w:instrText>
             </w:r>
             <w:r>
               <w:rPr>
@@ -1248,7 +1248,7 @@
                 <w:noProof/>
                 <w:webHidden/>
               </w:rPr>
-              <w:t>4</w:t>
+              <w:t>6</w:t>
             </w:r>
             <w:r>
               <w:rPr>
@@ -1274,17 +1274,17 @@
               <w:kern w:val="2"/>
               <w:sz w:val="24"/>
               <w:szCs w:val="24"/>
-              <w:lang w:val="es-CL" w:eastAsia="es-MX"/>
+              <w:lang w:val="es-CL" w:eastAsia="es-CL"/>
               <w14:ligatures w14:val="standardContextual"/>
             </w:rPr>
           </w:pPr>
-          <w:hyperlink w:anchor="_Toc241503861" w:history="1">
+          <w:hyperlink w:anchor="_Toc241610605" w:history="1">
             <w:r>
               <w:rPr>
                 <w:rStyle w:val="Hipervnculo"/>
                 <w:noProof/>
               </w:rPr>
-              <w:t>4.2.3</w:t>
+              <w:t>4.2.4</w:t>
             </w:r>
             <w:r>
               <w:rPr>
@@ -1295,7 +1295,7 @@
                 <w:kern w:val="2"/>
                 <w:sz w:val="24"/>
                 <w:szCs w:val="24"/>
-                <w:lang w:val="es-CL" w:eastAsia="es-MX"/>
+                <w:lang w:val="es-CL" w:eastAsia="es-CL"/>
                 <w14:ligatures w14:val="standardContextual"/>
               </w:rPr>
               <w:tab/>
@@ -1305,7 +1305,7 @@
                 <w:rStyle w:val="Hipervnculo"/>
                 <w:noProof/>
               </w:rPr>
-              <w:t>Usuario 1</w:t>
+              <w:t>Usuario 4: Administrador</w:t>
             </w:r>
             <w:r>
               <w:rPr>
@@ -1326,7 +1326,7 @@
                 <w:noProof/>
                 <w:webHidden/>
               </w:rPr>
-              <w:instrText xml:space="preserve"> PAGEREF _Toc241503861 \h </w:instrText>
+              <w:instrText xml:space="preserve"> PAGEREF _Toc241610605 \h </w:instrText>
             </w:r>
             <w:r>
               <w:rPr>
@@ -1346,7 +1346,105 @@
                 <w:noProof/>
                 <w:webHidden/>
               </w:rPr>
-              <w:t>4</w:t>
+              <w:t>7</w:t>
+            </w:r>
+            <w:r>
+              <w:rPr>
+                <w:noProof/>
+                <w:webHidden/>
+              </w:rPr>
+              <w:fldChar w:fldCharType="end"/>
+            </w:r>
+          </w:hyperlink>
+        </w:p>
+        <w:p>
+          <w:pPr>
+            <w:pStyle w:val="TDC3"/>
+            <w:tabs>
+              <w:tab w:val="left" w:pos="1320"/>
+              <w:tab w:val="right" w:leader="dot" w:pos="8828"/>
+            </w:tabs>
+            <w:rPr>
+              <w:rFonts w:eastAsiaTheme="minorEastAsia"/>
+              <w:i w:val="0"/>
+              <w:iCs w:val="0"/>
+              <w:noProof/>
+              <w:kern w:val="2"/>
+              <w:sz w:val="24"/>
+              <w:szCs w:val="24"/>
+              <w:lang w:val="es-CL" w:eastAsia="es-CL"/>
+              <w14:ligatures w14:val="standardContextual"/>
+            </w:rPr>
+          </w:pPr>
+          <w:hyperlink w:anchor="_Toc241610606" w:history="1">
+            <w:r>
+              <w:rPr>
+                <w:rStyle w:val="Hipervnculo"/>
+                <w:noProof/>
+              </w:rPr>
+              <w:t>4.2.5</w:t>
+            </w:r>
+            <w:r>
+              <w:rPr>
+                <w:rFonts w:eastAsiaTheme="minorEastAsia"/>
+                <w:i w:val="0"/>
+                <w:iCs w:val="0"/>
+                <w:noProof/>
+                <w:kern w:val="2"/>
+                <w:sz w:val="24"/>
+                <w:szCs w:val="24"/>
+                <w:lang w:val="es-CL" w:eastAsia="es-CL"/>
+                <w14:ligatures w14:val="standardContextual"/>
+              </w:rPr>
+              <w:tab/>
+            </w:r>
+            <w:r>
+              <w:rPr>
+                <w:rStyle w:val="Hipervnculo"/>
+                <w:noProof/>
+              </w:rPr>
+              <w:t>Usuario 5: Gerencia</w:t>
+            </w:r>
+            <w:r>
+              <w:rPr>
+                <w:noProof/>
+                <w:webHidden/>
+              </w:rPr>
+              <w:tab/>
+            </w:r>
+            <w:r>
+              <w:rPr>
+                <w:noProof/>
+                <w:webHidden/>
+              </w:rPr>
+              <w:fldChar w:fldCharType="begin"/>
+            </w:r>
+            <w:r>
+              <w:rPr>
+                <w:noProof/>
+                <w:webHidden/>
+              </w:rPr>
+              <w:instrText xml:space="preserve"> PAGEREF _Toc241610606 \h </w:instrText>
+            </w:r>
+            <w:r>
+              <w:rPr>
+                <w:noProof/>
+                <w:webHidden/>
+              </w:rPr>
+            </w:r>
+            <w:r>
+              <w:rPr>
+                <w:noProof/>
+                <w:webHidden/>
+              </w:rPr>
+              <w:fldChar w:fldCharType="separate"/>
+            </w:r>
+            <w:r>
+              <w:rPr>
+                <w:noProof/>
+                <w:webHidden/>
+              </w:rPr>
+              <w:t>7</w:t>
             </w:r>
             <w:r>
               <w:rPr>
@@ -1371,11 +1469,11 @@
               <w:kern w:val="2"/>
               <w:sz w:val="24"/>
               <w:szCs w:val="24"/>
-              <w:lang w:val="es-CL" w:eastAsia="es-MX"/>
+              <w:lang w:val="es-CL" w:eastAsia="es-CL"/>
               <w14:ligatures w14:val="standardContextual"/>
             </w:rPr>
           </w:pPr>
-          <w:hyperlink w:anchor="_Toc241503862" w:history="1">
+          <w:hyperlink w:anchor="_Toc241610607" w:history="1">
             <w:r>
               <w:rPr>
                 <w:rStyle w:val="Hipervnculo"/>
@@ -1392,7 +1490,7 @@
                 <w:kern w:val="2"/>
                 <w:sz w:val="24"/>
                 <w:szCs w:val="24"/>
-                <w:lang w:val="es-CL" w:eastAsia="es-MX"/>
+                <w:lang w:val="es-CL" w:eastAsia="es-CL"/>
                 <w14:ligatures w14:val="standardContextual"/>
               </w:rPr>
               <w:tab/>
@@ -1424,7 +1522,7 @@
                 <w:noProof/>
                 <w:webHidden/>
               </w:rPr>
-              <w:instrText xml:space="preserve"> PAGEREF _Toc241503862 \h </w:instrText>
+              <w:instrText xml:space="preserve"> PAGEREF _Toc241610607 \h </w:instrText>
             </w:r>
             <w:r>
               <w:rPr>
@@ -1444,7 +1542,7 @@
                 <w:noProof/>
                 <w:webHidden/>
               </w:rPr>
-              <w:t>4</w:t>
+              <w:t>8</w:t>
             </w:r>
             <w:r>
               <w:rPr>
@@ -1483,7 +1581,7 @@
         </w:rPr>
       </w:pPr>
       <w:bookmarkStart w:id="0" w:name="_Toc33411057"/>
-      <w:bookmarkStart w:id="1" w:name="_Toc241503854"/>
+      <w:bookmarkStart w:id="1" w:name="_Toc241610598"/>
       <w:r>
         <w:rPr>
           <w:rFonts w:asciiTheme="minorHAnsi" w:eastAsia="Times New Roman" w:hAnsiTheme="minorHAnsi" w:cstheme="minorHAnsi"/>
@@ -2166,7 +2264,7 @@
       <w:pPr>
         <w:pStyle w:val="Ttulo1"/>
       </w:pPr>
-      <w:bookmarkStart w:id="2" w:name="_Toc241503855"/>
+      <w:bookmarkStart w:id="2" w:name="_Toc241610599"/>
       <w:r>
         <w:t>Integrantes:</w:t>
       </w:r>
@@ -2289,6 +2387,15 @@
                 <w:lang w:val="es-ES" w:eastAsia="es-ES"/>
               </w:rPr>
             </w:pPr>
+            <w:r>
+              <w:rPr>
+                <w:rFonts w:asciiTheme="minorHAnsi" w:hAnsiTheme="minorHAnsi" w:cstheme="minorHAnsi"/>
+                <w:i/>
+                <w:szCs w:val="24"/>
+                <w:lang w:val="es-ES" w:eastAsia="es-ES"/>
+              </w:rPr>
+              <w:t>Project Manager</w:t>
+            </w:r>
           </w:p>
         </w:tc>
       </w:tr>
@@ -2319,6 +2426,7 @@
                 <w:szCs w:val="24"/>
                 <w:lang w:val="es-ES" w:eastAsia="es-ES"/>
               </w:rPr>
+              <w:lastRenderedPageBreak/>
               <w:t>Angelo</w:t>
             </w:r>
             <w:proofErr w:type="spellEnd"/>
@@ -2331,6 +2439,111 @@
               </w:rPr>
               <w:t xml:space="preserve"> Galindo</w:t>
             </w:r>
+          </w:p>
+        </w:tc>
+        <w:tc>
+          <w:tcPr>
+            <w:tcW w:w="5275" w:type="dxa"/>
+            <w:vAlign w:val="center"/>
+          </w:tcPr>
+          <w:p>
+            <w:pPr>
+              <w:jc w:val="both"/>
+              <w:rPr>
+                <w:rFonts w:cstheme="minorHAnsi"/>
+                <w:i/>
+                <w:szCs w:val="24"/>
+                <w:lang w:val="es-ES" w:eastAsia="es-ES"/>
+              </w:rPr>
+            </w:pPr>
+            <w:r>
+              <w:rPr>
+                <w:rFonts w:cstheme="minorHAnsi"/>
+                <w:i/>
+                <w:szCs w:val="24"/>
+                <w:lang w:val="es-ES" w:eastAsia="es-ES"/>
+              </w:rPr>
+              <w:t>QA</w:t>
+            </w:r>
+          </w:p>
+        </w:tc>
+      </w:tr>
+      <w:tr>
+        <w:trPr>
+          <w:trHeight w:val="465"/>
+        </w:trPr>
+        <w:tc>
+          <w:tcPr>
+            <w:tcW w:w="3539" w:type="dxa"/>
+            <w:vAlign w:val="center"/>
+          </w:tcPr>
+          <w:p>
+            <w:pPr>
+              <w:jc w:val="both"/>
+              <w:rPr>
+                <w:rFonts w:cstheme="minorHAnsi"/>
+                <w:i/>
+                <w:szCs w:val="24"/>
+                <w:lang w:val="es-ES" w:eastAsia="es-ES"/>
+              </w:rPr>
+            </w:pPr>
+            <w:r>
+              <w:rPr>
+                <w:rFonts w:cstheme="minorHAnsi"/>
+                <w:i/>
+                <w:szCs w:val="24"/>
+                <w:lang w:val="es-ES" w:eastAsia="es-ES"/>
+              </w:rPr>
+              <w:t>Diego Carrillo</w:t>
+            </w:r>
+          </w:p>
+        </w:tc>
+        <w:tc>
+          <w:tcPr>
+            <w:tcW w:w="5275" w:type="dxa"/>
+            <w:vAlign w:val="center"/>
+          </w:tcPr>
+          <w:p>
+            <w:pPr>
+              <w:jc w:val="both"/>
+              <w:rPr>
+                <w:rFonts w:cstheme="minorHAnsi"/>
+                <w:i/>
+                <w:szCs w:val="24"/>
+                <w:lang w:val="es-ES" w:eastAsia="es-ES"/>
+              </w:rPr>
+            </w:pPr>
+            <w:r>
+              <w:rPr>
+                <w:rFonts w:cstheme="minorHAnsi"/>
+                <w:i/>
+                <w:szCs w:val="24"/>
+                <w:lang w:val="es-ES" w:eastAsia="es-ES"/>
+              </w:rPr>
+              <w:t>Analista de base de datos</w:t>
+            </w:r>
+          </w:p>
+        </w:tc>
+      </w:tr>
+      <w:tr>
+        <w:trPr>
+          <w:trHeight w:val="465"/>
+        </w:trPr>
+        <w:tc>
+          <w:tcPr>
+            <w:tcW w:w="3539" w:type="dxa"/>
+            <w:vAlign w:val="center"/>
+          </w:tcPr>
+          <w:p>
+            <w:pPr>
+              <w:jc w:val="both"/>
+              <w:rPr>
+                <w:rFonts w:cstheme="minorHAnsi"/>
+                <w:i/>
+                <w:szCs w:val="24"/>
+                <w:lang w:val="es-ES" w:eastAsia="es-ES"/>
+              </w:rPr>
+            </w:pPr>
           </w:p>
         </w:tc>
         <w:tc>
@@ -2390,84 +2603,6 @@
           </w:p>
         </w:tc>
       </w:tr>
-      <w:tr>
-        <w:trPr>
-          <w:trHeight w:val="465"/>
-        </w:trPr>
-        <w:tc>
-          <w:tcPr>
-            <w:tcW w:w="3539" w:type="dxa"/>
-            <w:vAlign w:val="center"/>
-          </w:tcPr>
-          <w:p>
-            <w:pPr>
-              <w:jc w:val="both"/>
-              <w:rPr>
-                <w:rFonts w:cstheme="minorHAnsi"/>
-                <w:i/>
-                <w:szCs w:val="24"/>
-                <w:lang w:val="es-ES" w:eastAsia="es-ES"/>
-              </w:rPr>
-            </w:pPr>
-          </w:p>
-        </w:tc>
-        <w:tc>
-          <w:tcPr>
-            <w:tcW w:w="5275" w:type="dxa"/>
-            <w:vAlign w:val="center"/>
-          </w:tcPr>
-          <w:p>
-            <w:pPr>
-              <w:jc w:val="both"/>
-              <w:rPr>
-                <w:rFonts w:cstheme="minorHAnsi"/>
-                <w:i/>
-                <w:szCs w:val="24"/>
-                <w:lang w:val="es-ES" w:eastAsia="es-ES"/>
-              </w:rPr>
-            </w:pPr>
-          </w:p>
-        </w:tc>
-      </w:tr>
-      <w:tr>
-        <w:trPr>
-          <w:trHeight w:val="465"/>
-        </w:trPr>
-        <w:tc>
-          <w:tcPr>
-            <w:tcW w:w="3539" w:type="dxa"/>
-            <w:vAlign w:val="center"/>
-          </w:tcPr>
-          <w:p>
-            <w:pPr>
-              <w:jc w:val="both"/>
-              <w:rPr>
-                <w:rFonts w:cstheme="minorHAnsi"/>
-                <w:i/>
-                <w:szCs w:val="24"/>
-                <w:lang w:val="es-ES" w:eastAsia="es-ES"/>
-              </w:rPr>
-            </w:pPr>
-          </w:p>
-        </w:tc>
-        <w:tc>
-          <w:tcPr>
-            <w:tcW w:w="5275" w:type="dxa"/>
-            <w:vAlign w:val="center"/>
-          </w:tcPr>
-          <w:p>
-            <w:pPr>
-              <w:jc w:val="both"/>
-              <w:rPr>
-                <w:rFonts w:cstheme="minorHAnsi"/>
-                <w:i/>
-                <w:szCs w:val="24"/>
-                <w:lang w:val="es-ES" w:eastAsia="es-ES"/>
-              </w:rPr>
-            </w:pPr>
-          </w:p>
-        </w:tc>
-      </w:tr>
     </w:tbl>
     <w:p/>
     <w:p>
@@ -2497,7 +2632,7 @@
           <w:rFonts w:asciiTheme="minorHAnsi" w:hAnsiTheme="minorHAnsi" w:cstheme="minorHAnsi"/>
         </w:rPr>
       </w:pPr>
-      <w:bookmarkStart w:id="3" w:name="_Toc241503856"/>
+      <w:bookmarkStart w:id="3" w:name="_Toc241610600"/>
       <w:r>
         <w:rPr>
           <w:rFonts w:asciiTheme="minorHAnsi" w:hAnsiTheme="minorHAnsi" w:cstheme="minorHAnsi"/>
@@ -2515,7 +2650,7 @@
           <w:rFonts w:asciiTheme="minorHAnsi" w:hAnsiTheme="minorHAnsi" w:cstheme="minorHAnsi"/>
         </w:rPr>
       </w:pPr>
-      <w:bookmarkStart w:id="4" w:name="_Toc241503857"/>
+      <w:bookmarkStart w:id="4" w:name="_Toc241610601"/>
       <w:r>
         <w:rPr>
           <w:rFonts w:asciiTheme="minorHAnsi" w:hAnsiTheme="minorHAnsi" w:cstheme="minorHAnsi"/>
@@ -2757,7 +2892,7 @@
       <w:pPr>
         <w:pStyle w:val="Ttulo2"/>
       </w:pPr>
-      <w:bookmarkStart w:id="5" w:name="_Toc241503858"/>
+      <w:bookmarkStart w:id="5" w:name="_Toc241610602"/>
       <w:r>
         <w:lastRenderedPageBreak/>
         <w:t>Usuarios</w:t>
@@ -2919,17 +3054,17 @@
       <w:pPr>
         <w:pStyle w:val="Ttulo3"/>
       </w:pPr>
-      <w:bookmarkStart w:id="6" w:name="_Toc241503860"/>
+      <w:bookmarkStart w:id="6" w:name="_Toc241610603"/>
       <w:r>
         <w:t xml:space="preserve">Usuario </w:t>
       </w:r>
+      <w:r>
+        <w:t xml:space="preserve">2: </w:t>
+      </w:r>
+      <w:r>
+        <w:t>Operador de proceso</w:t>
+      </w:r>
       <w:bookmarkEnd w:id="6"/>
-      <w:r>
-        <w:t xml:space="preserve">2: </w:t>
-      </w:r>
-      <w:r>
-        <w:t>Operador de proceso</w:t>
-      </w:r>
     </w:p>
     <w:p>
       <w:pPr>
@@ -3061,17 +3196,17 @@
       <w:pPr>
         <w:pStyle w:val="Ttulo3"/>
       </w:pPr>
-      <w:bookmarkStart w:id="7" w:name="_Toc241503861"/>
+      <w:bookmarkStart w:id="7" w:name="_Toc241610604"/>
       <w:r>
         <w:t xml:space="preserve">Usuario </w:t>
       </w:r>
+      <w:r>
+        <w:t xml:space="preserve">3: </w:t>
+      </w:r>
+      <w:r>
+        <w:t>Operador de bodega</w:t>
+      </w:r>
       <w:bookmarkEnd w:id="7"/>
-      <w:r>
-        <w:t xml:space="preserve">3: </w:t>
-      </w:r>
-      <w:r>
-        <w:t>Operador de bodega</w:t>
-      </w:r>
     </w:p>
     <w:p>
       <w:pPr>
@@ -3202,6 +3337,7 @@
       <w:pPr>
         <w:pStyle w:val="Ttulo3"/>
       </w:pPr>
+      <w:bookmarkStart w:id="8" w:name="_Toc241610605"/>
       <w:r>
         <w:lastRenderedPageBreak/>
         <w:t>Usuario 4:</w:t>
@@ -3209,6 +3345,7 @@
       <w:r>
         <w:t xml:space="preserve"> Administrador</w:t>
       </w:r>
+      <w:bookmarkEnd w:id="8"/>
     </w:p>
     <w:p>
       <w:pPr>
@@ -3347,6 +3484,7 @@
       <w:pPr>
         <w:pStyle w:val="Ttulo3"/>
       </w:pPr>
+      <w:bookmarkStart w:id="9" w:name="_Toc241610606"/>
       <w:r>
         <w:t>Usuario 5</w:t>
       </w:r>
@@ -3356,6 +3494,7 @@
       <w:r>
         <w:t>Gerencia</w:t>
       </w:r>
+      <w:bookmarkEnd w:id="9"/>
     </w:p>
     <w:p>
       <w:pPr>
@@ -3478,14 +3617,14 @@
           <w:lang w:val="es-ES" w:eastAsia="es-ES"/>
         </w:rPr>
       </w:pPr>
-      <w:bookmarkStart w:id="8" w:name="_Toc241503862"/>
+      <w:bookmarkStart w:id="10" w:name="_Toc241610607"/>
       <w:r>
         <w:rPr>
           <w:lang w:val="es-ES" w:eastAsia="es-ES"/>
         </w:rPr>
         <w:t>Propuesta de Valor</w:t>
       </w:r>
-      <w:bookmarkEnd w:id="8"/>
+      <w:bookmarkEnd w:id="10"/>
     </w:p>
     <w:p>
       <w:pPr>
@@ -3784,13 +3923,7 @@
               <w:rPr>
                 <w:lang w:val="es-CL" w:eastAsia="es-ES"/>
               </w:rPr>
-              <w:t>nterfaz</w:t>
-            </w:r>
-            <w:r>
-              <w:rPr>
-                <w:lang w:val="es-CL" w:eastAsia="es-ES"/>
-              </w:rPr>
-              <w:t xml:space="preserve"> antigua y poco intuitiva. Por ejemplo, al ingresar un dato el cursor no pasa automáticamente al campo siguiente, lo que obliga a moverse a mano entre los campos. Además, no hay validación al ingresar los datos y existe el riesgo de que una recepción quede guardada a medias</w:t>
+              <w:t>nterfaz antigua y poco intuitiva. Por ejemplo, al ingresar un dato el cursor no pasa automáticamente al campo siguiente, lo que obliga a moverse a mano entre los campos. Además, no hay validación al ingresar los datos y existe el riesgo de que una recepción quede guardada a medias</w:t>
             </w:r>
             <w:r>
               <w:rPr>
@@ -8461,10 +8594,12 @@
     <w:rsid w:val="006E2FCC"/>
     <w:rsid w:val="00704192"/>
     <w:rsid w:val="00825B36"/>
+    <w:rsid w:val="008720E7"/>
     <w:rsid w:val="009007E1"/>
     <w:rsid w:val="00924410"/>
     <w:rsid w:val="00960213"/>
     <w:rsid w:val="009B18C0"/>
+    <w:rsid w:val="00B069A8"/>
     <w:rsid w:val="00BD2436"/>
     <w:rsid w:val="00C47BA2"/>
     <w:rsid w:val="00C5036F"/>
@@ -9225,6 +9360,25 @@
 </file>
 
 <file path=customXml/item2.xml><?xml version="1.0" encoding="utf-8"?>
+<p:properties xmlns:p="http://schemas.microsoft.com/office/2006/metadata/properties" xmlns:xsi="http://www.w3.org/2001/XMLSchema-instance" xmlns:pc="http://schemas.microsoft.com/office/infopath/2007/PartnerControls">
+  <documentManagement>
+    <lcf76f155ced4ddcb4097134ff3c332f xmlns="e1e7bc46-bed0-459f-9452-a76b1c5b695e">
+      <Terms xmlns="http://schemas.microsoft.com/office/infopath/2007/PartnerControls"/>
+    </lcf76f155ced4ddcb4097134ff3c332f>
+  </documentManagement>
+</p:properties>
+</file>
+
+<file path=customXml/item3.xml><?xml version="1.0" encoding="utf-8"?>
+<?mso-contentType ?>
+<FormTemplates xmlns="http://schemas.microsoft.com/sharepoint/v3/contenttype/forms">
+  <Display>DocumentLibraryForm</Display>
+  <Edit>DocumentLibraryForm</Edit>
+  <New>DocumentLibraryForm</New>
+</FormTemplates>
+</file>
+
+<file path=customXml/item4.xml><?xml version="1.0" encoding="utf-8"?>
 <ct:contentTypeSchema xmlns:ct="http://schemas.microsoft.com/office/2006/metadata/contentType" xmlns:ma="http://schemas.microsoft.com/office/2006/metadata/properties/metaAttributes" ct:_="" ma:_="" ma:contentTypeName="Documento" ma:contentTypeID="0x0101005395107FFD641345A10C8A5ACACB9D20" ma:contentTypeVersion="13" ma:contentTypeDescription="Crear nuevo documento." ma:contentTypeScope="" ma:versionID="7407f70e7181b908656026f379795b2c">
   <xsd:schema xmlns:xsd="http://www.w3.org/2001/XMLSchema" xmlns:xs="http://www.w3.org/2001/XMLSchema" xmlns:p="http://schemas.microsoft.com/office/2006/metadata/properties" xmlns:ns2="e1e7bc46-bed0-459f-9452-a76b1c5b695e" xmlns:ns3="bb8cf7e1-610f-40a0-8f00-126b9d139fde" targetNamespace="http://schemas.microsoft.com/office/2006/metadata/properties" ma:root="true" ma:fieldsID="b29ea8901729e1eaaa4e48e09148c760" ns2:_="" ns3:_="">
     <xsd:import namespace="e1e7bc46-bed0-459f-9452-a76b1c5b695e"/>
@@ -9441,25 +9595,6 @@
 </ct:contentTypeSchema>
 </file>
 
-<file path=customXml/item3.xml><?xml version="1.0" encoding="utf-8"?>
-<?mso-contentType ?>
-<FormTemplates xmlns="http://schemas.microsoft.com/sharepoint/v3/contenttype/forms">
-  <Display>DocumentLibraryForm</Display>
-  <Edit>DocumentLibraryForm</Edit>
-  <New>DocumentLibraryForm</New>
-</FormTemplates>
-</file>
-
-<file path=customXml/item4.xml><?xml version="1.0" encoding="utf-8"?>
-<p:properties xmlns:p="http://schemas.microsoft.com/office/2006/metadata/properties" xmlns:xsi="http://www.w3.org/2001/XMLSchema-instance" xmlns:pc="http://schemas.microsoft.com/office/infopath/2007/PartnerControls">
-  <documentManagement>
-    <lcf76f155ced4ddcb4097134ff3c332f xmlns="e1e7bc46-bed0-459f-9452-a76b1c5b695e">
-      <Terms xmlns="http://schemas.microsoft.com/office/infopath/2007/PartnerControls"/>
-    </lcf76f155ced4ddcb4097134ff3c332f>
-  </documentManagement>
-</p:properties>
-</file>
-
 <file path=customXml/item5.xml><?xml version="1.0" encoding="utf-8"?>
 <b:Sources xmlns:b="http://schemas.openxmlformats.org/officeDocument/2006/bibliography" xmlns="http://schemas.openxmlformats.org/officeDocument/2006/bibliography" SelectedStyle="\APA.XSL" StyleName="APA"/>
 </file>
@@ -9473,6 +9608,24 @@
 </file>
 
 <file path=customXml/itemProps2.xml><?xml version="1.0" encoding="utf-8"?>
+<ds:datastoreItem xmlns:ds="http://schemas.openxmlformats.org/officeDocument/2006/customXml" ds:itemID="{E1036DFC-1D85-404D-898C-621D06C0EB1C}">
+  <ds:schemaRefs>
+    <ds:schemaRef ds:uri="http://schemas.microsoft.com/office/2006/metadata/properties"/>
+    <ds:schemaRef ds:uri="http://schemas.microsoft.com/office/infopath/2007/PartnerControls"/>
+    <ds:schemaRef ds:uri="e1e7bc46-bed0-459f-9452-a76b1c5b695e"/>
+  </ds:schemaRefs>
+</ds:datastoreItem>
+</file>
+
+<file path=customXml/itemProps3.xml><?xml version="1.0" encoding="utf-8"?>
+<ds:datastoreItem xmlns:ds="http://schemas.openxmlformats.org/officeDocument/2006/customXml" ds:itemID="{EE9AAF0E-D63F-459F-A0FB-CDCE9F728F33}">
+  <ds:schemaRefs>
+    <ds:schemaRef ds:uri="http://schemas.microsoft.com/sharepoint/v3/contenttype/forms"/>
+  </ds:schemaRefs>
+</ds:datastoreItem>
+</file>
+
+<file path=customXml/itemProps4.xml><?xml version="1.0" encoding="utf-8"?>
 <ds:datastoreItem xmlns:ds="http://schemas.openxmlformats.org/officeDocument/2006/customXml" ds:itemID="{444115BD-C1C6-48AD-B714-E1866627071D}">
   <ds:schemaRefs>
     <ds:schemaRef ds:uri="http://schemas.microsoft.com/office/2006/metadata/contentType"/>
@@ -9491,24 +9644,6 @@
 </ds:datastoreItem>
 </file>
 
-<file path=customXml/itemProps3.xml><?xml version="1.0" encoding="utf-8"?>
-<ds:datastoreItem xmlns:ds="http://schemas.openxmlformats.org/officeDocument/2006/customXml" ds:itemID="{EE9AAF0E-D63F-459F-A0FB-CDCE9F728F33}">
-  <ds:schemaRefs>
-    <ds:schemaRef ds:uri="http://schemas.microsoft.com/sharepoint/v3/contenttype/forms"/>
-  </ds:schemaRefs>
-</ds:datastoreItem>
-</file>
-
-<file path=customXml/itemProps4.xml><?xml version="1.0" encoding="utf-8"?>
-<ds:datastoreItem xmlns:ds="http://schemas.openxmlformats.org/officeDocument/2006/customXml" ds:itemID="{E1036DFC-1D85-404D-898C-621D06C0EB1C}">
-  <ds:schemaRefs>
-    <ds:schemaRef ds:uri="http://schemas.microsoft.com/office/2006/metadata/properties"/>
-    <ds:schemaRef ds:uri="http://schemas.microsoft.com/office/infopath/2007/PartnerControls"/>
-    <ds:schemaRef ds:uri="e1e7bc46-bed0-459f-9452-a76b1c5b695e"/>
-  </ds:schemaRefs>
-</ds:datastoreItem>
-</file>
-
 <file path=customXml/itemProps5.xml><?xml version="1.0" encoding="utf-8"?>
 <ds:datastoreItem xmlns:ds="http://schemas.openxmlformats.org/officeDocument/2006/customXml" ds:itemID="{BD6EC776-6679-4C69-98E3-6D068EA0A3C9}">
   <ds:schemaRefs>

</xml_diff>

<commit_message>
comit corrección tabla visión
</commit_message>
<xml_diff>
--- a/Fase 2/Evidencias Proyecto (version Agil)/Documento 01- Product Vision.docx
+++ b/Fase 2/Evidencias Proyecto (version Agil)/Documento 01- Product Vision.docx
@@ -314,9 +314,9 @@
                 </w:rPr>
                 <w:alias w:val="Fecha"/>
                 <w:id w:val="516659546"/>
-                <w:showingPlcHdr/>
                 <w:dataBinding w:prefixMappings="xmlns:ns0='http://schemas.microsoft.com/office/2006/coverPageProps'" w:xpath="/ns0:CoverPageProperties[1]/ns0:PublishDate[1]" w:storeItemID="{55AF091B-3C7A-41E3-B477-F2FDAA23CFDA}"/>
-                <w:date>
+                <w:date w:fullDate="2026-10-03T00:00:00Z">
+                  <w:dateFormat w:val="dd/MM/yyyy"/>
                   <w:lid w:val="es-ES"/>
                   <w:storeMappedDataAs w:val="dateTime"/>
                   <w:calendar w:val="gregorian"/>
@@ -343,9 +343,8 @@
                         <w:rFonts w:cstheme="minorHAnsi"/>
                         <w:b/>
                         <w:bCs/>
-                        <w:color w:val="FF0000"/>
                       </w:rPr>
-                      <w:t>[Seleccionar fecha]</w:t>
+                      <w:t>03/10/2026</w:t>
                     </w:r>
                   </w:p>
                 </w:tc>
@@ -2436,26 +2435,6 @@
                 <w:lang w:val="es-ES" w:eastAsia="es-ES"/>
               </w:rPr>
             </w:pPr>
-            <w:r>
-              <w:rPr>
-                <w:rFonts w:cstheme="minorHAnsi"/>
-                <w:i/>
-                <w:szCs w:val="24"/>
-                <w:lang w:val="es-ES" w:eastAsia="es-ES"/>
-              </w:rPr>
-              <w:t xml:space="preserve">Alejandro </w:t>
-            </w:r>
-            <w:proofErr w:type="spellStart"/>
-            <w:r>
-              <w:rPr>
-                <w:rFonts w:cstheme="minorHAnsi"/>
-                <w:i/>
-                <w:szCs w:val="24"/>
-                <w:lang w:val="es-ES" w:eastAsia="es-ES"/>
-              </w:rPr>
-              <w:t>rodriguez</w:t>
-            </w:r>
-            <w:proofErr w:type="spellEnd"/>
           </w:p>
         </w:tc>
         <w:tc>
@@ -2473,54 +2452,6 @@
                 <w:lang w:val="es-ES" w:eastAsia="es-ES"/>
               </w:rPr>
             </w:pPr>
-            <w:r>
-              <w:rPr>
-                <w:rFonts w:cstheme="minorHAnsi"/>
-                <w:i/>
-                <w:szCs w:val="24"/>
-                <w:lang w:val="es-ES" w:eastAsia="es-ES"/>
-              </w:rPr>
-              <w:t>PM</w:t>
-            </w:r>
-          </w:p>
-        </w:tc>
-      </w:tr>
-      <w:tr>
-        <w:trPr>
-          <w:trHeight w:val="465"/>
-        </w:trPr>
-        <w:tc>
-          <w:tcPr>
-            <w:tcW w:w="3539" w:type="dxa"/>
-            <w:vAlign w:val="center"/>
-          </w:tcPr>
-          <w:p>
-            <w:pPr>
-              <w:jc w:val="both"/>
-              <w:rPr>
-                <w:rFonts w:cstheme="minorHAnsi"/>
-                <w:i/>
-                <w:szCs w:val="24"/>
-                <w:lang w:val="es-ES" w:eastAsia="es-ES"/>
-              </w:rPr>
-            </w:pPr>
-          </w:p>
-        </w:tc>
-        <w:tc>
-          <w:tcPr>
-            <w:tcW w:w="5275" w:type="dxa"/>
-            <w:vAlign w:val="center"/>
-          </w:tcPr>
-          <w:p>
-            <w:pPr>
-              <w:jc w:val="both"/>
-              <w:rPr>
-                <w:rFonts w:cstheme="minorHAnsi"/>
-                <w:i/>
-                <w:szCs w:val="24"/>
-                <w:lang w:val="es-ES" w:eastAsia="es-ES"/>
-              </w:rPr>
-            </w:pPr>
           </w:p>
         </w:tc>
       </w:tr>
@@ -3432,7 +3363,19 @@
         <w:rPr>
           <w:lang w:val="es-ES" w:eastAsia="es-ES"/>
         </w:rPr>
-        <w:t>Visión de la temporada: conocer el resultado de la operación (volúmenes, rendimientos y mermas por productor, especie o variedad) para planificar las próximas temporadas.</w:t>
+        <w:t xml:space="preserve">Visión de la temporada: conocer el resultado de la operación (volúmenes, rendimientos y mermas por productor, especie o variedad) para planificar las próximas </w:t>
+      </w:r>
+      <w:r>
+        <w:rPr>
+          <w:lang w:val="es-ES" w:eastAsia="es-ES"/>
+        </w:rPr>
+        <w:t>temporadas</w:t>
+      </w:r>
+      <w:r>
+        <w:rPr>
+          <w:lang w:val="es-ES" w:eastAsia="es-ES"/>
+        </w:rPr>
+        <w:t>. (para fases posteriores)</w:t>
       </w:r>
     </w:p>
     <w:p>
@@ -3468,19 +3411,23 @@
         <w:rPr>
           <w:lang w:val="es-CL" w:eastAsia="es-ES"/>
         </w:rPr>
-        <w:t>A2D SM es una nueva plataforma de trazabilidad de fruta que se construye en paralelo al sistema actual de Socradex. Reemplaza el acceso directo a la base de datos por una aplicación web segura, con acceso según el perfil de cada usuario, cálculos automáticos y un registro de auditoría de cada cambio. Con esto, cada usuario de la planta trabaja solo en su área, con información consistente y trazable desde la recepción de la fruta hasta su proceso. Esa es la base para los módulos de bodega, despacho y reportes</w:t>
-      </w:r>
-      <w:r>
-        <w:rPr>
-          <w:lang w:val="es-CL" w:eastAsia="es-ES"/>
-        </w:rPr>
-        <w:t xml:space="preserve"> serán</w:t>
-      </w:r>
-      <w:r>
-        <w:rPr>
-          <w:lang w:val="es-CL" w:eastAsia="es-ES"/>
-        </w:rPr>
-        <w:t xml:space="preserve"> de fases posteriores.</w:t>
+        <w:t>A2D SM es una nueva plataforma de trazabilidad de fruta que se construye en paralelo al sistema actual de Socradex. Reemplaza el acceso directo a la base de datos por una aplicación web segura, con acceso según el perfil de cada usuario, cálculos automáticos y un registro de auditoría de cada cambio. Con esto, cada usuario de la planta trabaja solo en su área, con información consistente y trazable desde la recepción de la fruta hasta su proceso.</w:t>
+      </w:r>
+      <w:r>
+        <w:rPr>
+          <w:rFonts w:ascii="Roboto" w:hAnsi="Roboto"/>
+          <w:color w:val="E3E3E3"/>
+          <w:sz w:val="21"/>
+          <w:szCs w:val="21"/>
+          <w:shd w:val="clear" w:color="auto" w:fill="303030"/>
+        </w:rPr>
+        <w:t xml:space="preserve"> </w:t>
+      </w:r>
+      <w:r>
+        <w:rPr>
+          <w:lang w:eastAsia="es-ES"/>
+        </w:rPr>
+        <w:t>Esa es la base para los módulos de bodega, despacho y reportes, que quedan para fases posteriores.</w:t>
       </w:r>
     </w:p>
     <w:p>
@@ -3915,6 +3862,19 @@
               <w:rPr>
                 <w:lang w:eastAsia="es-ES"/>
               </w:rPr>
+              <w:t>Avance automático entre campos: sí, en el 100 % de los formularios</w:t>
+            </w:r>
+          </w:p>
+          <w:p>
+            <w:pPr>
+              <w:rPr>
+                <w:lang w:eastAsia="es-ES"/>
+              </w:rPr>
+            </w:pPr>
+            <w:r>
+              <w:rPr>
+                <w:lang w:eastAsia="es-ES"/>
+              </w:rPr>
               <w:t>Validación al ingresar los datos: 100 % de los campos obligatorios y rangos de peso</w:t>
             </w:r>
             <w:r>
@@ -4548,6 +4508,19 @@
             <w:vAlign w:val="center"/>
             <w:hideMark/>
           </w:tcPr>
+          <w:p>
+            <w:pPr>
+              <w:rPr>
+                <w:lang w:eastAsia="es-ES"/>
+              </w:rPr>
+            </w:pPr>
+            <w:r>
+              <w:rPr>
+                <w:lang w:eastAsia="es-ES"/>
+              </w:rPr>
+              <w:t>Trazabilidad de una tarja en una sola consulta.</w:t>
+            </w:r>
+          </w:p>
           <w:p>
             <w:pPr>
               <w:rPr>
@@ -8232,6 +8205,12 @@
     <w:pitch w:val="fixed"/>
     <w:sig w:usb0="E00002FF" w:usb1="6AC7FDFB" w:usb2="08000012" w:usb3="00000000" w:csb0="0002009F" w:csb1="00000000"/>
   </w:font>
+  <w:font w:name="Roboto">
+    <w:charset w:val="00"/>
+    <w:family w:val="auto"/>
+    <w:pitch w:val="variable"/>
+    <w:sig w:usb0="E0000AFF" w:usb1="5000217F" w:usb2="00000021" w:usb3="00000000" w:csb0="0000019F" w:csb1="00000000"/>
+  </w:font>
   <w:font w:name="Aptos">
     <w:charset w:val="00"/>
     <w:family w:val="swiss"/>
@@ -8285,6 +8264,7 @@
     <w:rsid w:val="00252686"/>
     <w:rsid w:val="002835FC"/>
     <w:rsid w:val="002C06A7"/>
+    <w:rsid w:val="003A4342"/>
     <w:rsid w:val="004326AC"/>
     <w:rsid w:val="004F7F49"/>
     <w:rsid w:val="005071E9"/>
@@ -8301,6 +8281,7 @@
     <w:rsid w:val="00924410"/>
     <w:rsid w:val="00960213"/>
     <w:rsid w:val="009B18C0"/>
+    <w:rsid w:val="00A93BB9"/>
     <w:rsid w:val="00B069A8"/>
     <w:rsid w:val="00BD2436"/>
     <w:rsid w:val="00C47BA2"/>
@@ -9053,7 +9034,7 @@
 
 <file path=customXml/item1.xml><?xml version="1.0" encoding="utf-8"?>
 <CoverPageProperties xmlns="http://schemas.microsoft.com/office/2006/coverPageProps">
-  <PublishDate/>
+  <PublishDate>2026-10-03T00:00:00</PublishDate>
   <Abstract>Planificación y Especificación de Requisitos según estándares; IEEE 830, ISO9000 y PMI.</Abstract>
   <CompanyAddress/>
   <CompanyPhone/>
@@ -9063,29 +9044,6 @@
 </file>
 
 <file path=customXml/item2.xml><?xml version="1.0" encoding="utf-8"?>
-<b:Sources xmlns:b="http://schemas.openxmlformats.org/officeDocument/2006/bibliography" xmlns="http://schemas.openxmlformats.org/officeDocument/2006/bibliography" SelectedStyle="\APA.XSL" StyleName="APA"/>
-</file>
-
-<file path=customXml/item3.xml><?xml version="1.0" encoding="utf-8"?>
-<p:properties xmlns:p="http://schemas.microsoft.com/office/2006/metadata/properties" xmlns:xsi="http://www.w3.org/2001/XMLSchema-instance" xmlns:pc="http://schemas.microsoft.com/office/infopath/2007/PartnerControls">
-  <documentManagement>
-    <lcf76f155ced4ddcb4097134ff3c332f xmlns="e1e7bc46-bed0-459f-9452-a76b1c5b695e">
-      <Terms xmlns="http://schemas.microsoft.com/office/infopath/2007/PartnerControls"/>
-    </lcf76f155ced4ddcb4097134ff3c332f>
-  </documentManagement>
-</p:properties>
-</file>
-
-<file path=customXml/item4.xml><?xml version="1.0" encoding="utf-8"?>
-<?mso-contentType ?>
-<FormTemplates xmlns="http://schemas.microsoft.com/sharepoint/v3/contenttype/forms">
-  <Display>DocumentLibraryForm</Display>
-  <Edit>DocumentLibraryForm</Edit>
-  <New>DocumentLibraryForm</New>
-</FormTemplates>
-</file>
-
-<file path=customXml/item5.xml><?xml version="1.0" encoding="utf-8"?>
 <ct:contentTypeSchema xmlns:ct="http://schemas.microsoft.com/office/2006/metadata/contentType" xmlns:ma="http://schemas.microsoft.com/office/2006/metadata/properties/metaAttributes" ct:_="" ma:_="" ma:contentTypeName="Documento" ma:contentTypeID="0x0101005395107FFD641345A10C8A5ACACB9D20" ma:contentTypeVersion="13" ma:contentTypeDescription="Crear nuevo documento." ma:contentTypeScope="" ma:versionID="7407f70e7181b908656026f379795b2c">
   <xsd:schema xmlns:xsd="http://www.w3.org/2001/XMLSchema" xmlns:xs="http://www.w3.org/2001/XMLSchema" xmlns:p="http://schemas.microsoft.com/office/2006/metadata/properties" xmlns:ns2="e1e7bc46-bed0-459f-9452-a76b1c5b695e" xmlns:ns3="bb8cf7e1-610f-40a0-8f00-126b9d139fde" targetNamespace="http://schemas.microsoft.com/office/2006/metadata/properties" ma:root="true" ma:fieldsID="b29ea8901729e1eaaa4e48e09148c760" ns2:_="" ns3:_="">
     <xsd:import namespace="e1e7bc46-bed0-459f-9452-a76b1c5b695e"/>
@@ -9302,6 +9260,29 @@
 </ct:contentTypeSchema>
 </file>
 
+<file path=customXml/item3.xml><?xml version="1.0" encoding="utf-8"?>
+<?mso-contentType ?>
+<FormTemplates xmlns="http://schemas.microsoft.com/sharepoint/v3/contenttype/forms">
+  <Display>DocumentLibraryForm</Display>
+  <Edit>DocumentLibraryForm</Edit>
+  <New>DocumentLibraryForm</New>
+</FormTemplates>
+</file>
+
+<file path=customXml/item4.xml><?xml version="1.0" encoding="utf-8"?>
+<p:properties xmlns:p="http://schemas.microsoft.com/office/2006/metadata/properties" xmlns:xsi="http://www.w3.org/2001/XMLSchema-instance" xmlns:pc="http://schemas.microsoft.com/office/infopath/2007/PartnerControls">
+  <documentManagement>
+    <lcf76f155ced4ddcb4097134ff3c332f xmlns="e1e7bc46-bed0-459f-9452-a76b1c5b695e">
+      <Terms xmlns="http://schemas.microsoft.com/office/infopath/2007/PartnerControls"/>
+    </lcf76f155ced4ddcb4097134ff3c332f>
+  </documentManagement>
+</p:properties>
+</file>
+
+<file path=customXml/item5.xml><?xml version="1.0" encoding="utf-8"?>
+<b:Sources xmlns:b="http://schemas.openxmlformats.org/officeDocument/2006/bibliography" xmlns="http://schemas.openxmlformats.org/officeDocument/2006/bibliography" SelectedStyle="\APA.XSL" StyleName="APA"/>
+</file>
+
 <file path=customXml/itemProps1.xml><?xml version="1.0" encoding="utf-8"?>
 <ds:datastoreItem xmlns:ds="http://schemas.openxmlformats.org/officeDocument/2006/customXml" ds:itemID="{55AF091B-3C7A-41E3-B477-F2FDAA23CFDA}">
   <ds:schemaRefs>
@@ -9311,32 +9292,6 @@
 </file>
 
 <file path=customXml/itemProps2.xml><?xml version="1.0" encoding="utf-8"?>
-<ds:datastoreItem xmlns:ds="http://schemas.openxmlformats.org/officeDocument/2006/customXml" ds:itemID="{BD6EC776-6679-4C69-98E3-6D068EA0A3C9}">
-  <ds:schemaRefs>
-    <ds:schemaRef ds:uri="http://schemas.openxmlformats.org/officeDocument/2006/bibliography"/>
-  </ds:schemaRefs>
-</ds:datastoreItem>
-</file>
-
-<file path=customXml/itemProps3.xml><?xml version="1.0" encoding="utf-8"?>
-<ds:datastoreItem xmlns:ds="http://schemas.openxmlformats.org/officeDocument/2006/customXml" ds:itemID="{E1036DFC-1D85-404D-898C-621D06C0EB1C}">
-  <ds:schemaRefs>
-    <ds:schemaRef ds:uri="http://schemas.microsoft.com/office/2006/metadata/properties"/>
-    <ds:schemaRef ds:uri="http://schemas.microsoft.com/office/infopath/2007/PartnerControls"/>
-    <ds:schemaRef ds:uri="e1e7bc46-bed0-459f-9452-a76b1c5b695e"/>
-  </ds:schemaRefs>
-</ds:datastoreItem>
-</file>
-
-<file path=customXml/itemProps4.xml><?xml version="1.0" encoding="utf-8"?>
-<ds:datastoreItem xmlns:ds="http://schemas.openxmlformats.org/officeDocument/2006/customXml" ds:itemID="{EE9AAF0E-D63F-459F-A0FB-CDCE9F728F33}">
-  <ds:schemaRefs>
-    <ds:schemaRef ds:uri="http://schemas.microsoft.com/sharepoint/v3/contenttype/forms"/>
-  </ds:schemaRefs>
-</ds:datastoreItem>
-</file>
-
-<file path=customXml/itemProps5.xml><?xml version="1.0" encoding="utf-8"?>
 <ds:datastoreItem xmlns:ds="http://schemas.openxmlformats.org/officeDocument/2006/customXml" ds:itemID="{444115BD-C1C6-48AD-B714-E1866627071D}">
   <ds:schemaRefs>
     <ds:schemaRef ds:uri="http://schemas.microsoft.com/office/2006/metadata/contentType"/>
@@ -9353,4 +9308,30 @@
     <ds:schemaRef ds:uri="http://schemas.microsoft.com/internal/obd"/>
   </ds:schemaRefs>
 </ds:datastoreItem>
+</file>
+
+<file path=customXml/itemProps3.xml><?xml version="1.0" encoding="utf-8"?>
+<ds:datastoreItem xmlns:ds="http://schemas.openxmlformats.org/officeDocument/2006/customXml" ds:itemID="{EE9AAF0E-D63F-459F-A0FB-CDCE9F728F33}">
+  <ds:schemaRefs>
+    <ds:schemaRef ds:uri="http://schemas.microsoft.com/sharepoint/v3/contenttype/forms"/>
+  </ds:schemaRefs>
+</ds:datastoreItem>
+</file>
+
+<file path=customXml/itemProps4.xml><?xml version="1.0" encoding="utf-8"?>
+<ds:datastoreItem xmlns:ds="http://schemas.openxmlformats.org/officeDocument/2006/customXml" ds:itemID="{E1036DFC-1D85-404D-898C-621D06C0EB1C}">
+  <ds:schemaRefs>
+    <ds:schemaRef ds:uri="http://schemas.microsoft.com/office/2006/metadata/properties"/>
+    <ds:schemaRef ds:uri="http://schemas.microsoft.com/office/infopath/2007/PartnerControls"/>
+    <ds:schemaRef ds:uri="e1e7bc46-bed0-459f-9452-a76b1c5b695e"/>
+  </ds:schemaRefs>
+</ds:datastoreItem>
+</file>
+
+<file path=customXml/itemProps5.xml><?xml version="1.0" encoding="utf-8"?>
+<ds:datastoreItem xmlns:ds="http://schemas.openxmlformats.org/officeDocument/2006/customXml" ds:itemID="{BD6EC776-6679-4C69-98E3-6D068EA0A3C9}">
+  <ds:schemaRefs>
+    <ds:schemaRef ds:uri="http://schemas.openxmlformats.org/officeDocument/2006/bibliography"/>
+  </ds:schemaRefs>
+</ds:datastoreItem>
 </file>
</xml_diff>